<commit_message>
feat: actualizando articulo cientifico
</commit_message>
<xml_diff>
--- a/Articulo Cientifico.docx
+++ b/Articulo Cientifico.docx
@@ -5,6 +5,7 @@
     <w:p>
       <w:pPr>
         <w:spacing w:after="120" w:line="360" w:lineRule="auto"/>
+        <w:ind w:left="708" w:hanging="708"/>
         <w:jc w:val="center"/>
         <w:rPr>
           <w:rFonts w:ascii="Arial" w:hAnsi="Arial" w:cs="Arial"/>
@@ -399,7 +400,23 @@
           <w:sz w:val="24"/>
           <w:szCs w:val="24"/>
         </w:rPr>
-        <w:t>Recibido: 22/04/2026</w:t>
+        <w:t>Recibido: 2</w:t>
+      </w:r>
+      <w:r>
+        <w:rPr>
+          <w:rFonts w:ascii="Arial" w:hAnsi="Arial" w:cs="Arial"/>
+          <w:sz w:val="24"/>
+          <w:szCs w:val="24"/>
+        </w:rPr>
+        <w:t>5</w:t>
+      </w:r>
+      <w:r>
+        <w:rPr>
+          <w:rFonts w:ascii="Arial" w:hAnsi="Arial" w:cs="Arial"/>
+          <w:sz w:val="24"/>
+          <w:szCs w:val="24"/>
+        </w:rPr>
+        <w:t>/04/2026</w:t>
       </w:r>
     </w:p>
     <w:p>
@@ -658,7 +675,23 @@
           <w:sz w:val="24"/>
           <w:szCs w:val="24"/>
         </w:rPr>
-        <w:t xml:space="preserve"> por hash MD5, quedó reducido a 5,745 para entrenamiento y 550 para prueba. El sistema emplea dos modelos en cascada: el Modelo 1 clasifica soya sana vs. enferma (1,000 imágenes/clase) y el Modelo 2 identifica el tipo de patógeno en cinco categorías (bacterianas, fúngicas, roya, virales y plagas/insectos) con 749 imágenes/clase. La evaluación sobre 550 imágenes de prueba arrojó una exactitud del 98.00% para el Modelo 1 (F1: 0.9804) y del 95.09% para el Modelo 2 (F1 promedio: 0.9472). En conclusión, </w:t>
+        <w:t xml:space="preserve"> por hash MD5, quedó reducido a 5,745 para entrenamiento y 550 para prueba. El sistema emplea dos modelos en cascada: el Modelo 1 clasifica soya sana vs. enferma (1,000 imágenes/clase) y el Modelo 2 identifica el tipo de patógeno en cinco categorías (bacterianas, fúngicas, roya, virales y plagas/insectos) con 749 imágenes/clase. La evaluación sobre 550 imágenes de prueba arrojó una exactitud del 98.00% para el Modelo 1 (F1: 0.9804) y del 95.</w:t>
+      </w:r>
+      <w:r>
+        <w:rPr>
+          <w:rFonts w:ascii="Arial" w:hAnsi="Arial" w:cs="Arial"/>
+          <w:sz w:val="24"/>
+          <w:szCs w:val="24"/>
+        </w:rPr>
+        <w:t>14</w:t>
+      </w:r>
+      <w:r>
+        <w:rPr>
+          <w:rFonts w:ascii="Arial" w:hAnsi="Arial" w:cs="Arial"/>
+          <w:sz w:val="24"/>
+          <w:szCs w:val="24"/>
+        </w:rPr>
+        <w:t xml:space="preserve">% para el Modelo 2 (F1 promedio: 0.9472). En conclusión, </w:t>
       </w:r>
       <w:proofErr w:type="spellStart"/>
       <w:r>
@@ -2580,7 +2613,23 @@
           <w:sz w:val="24"/>
           <w:szCs w:val="24"/>
         </w:rPr>
-        <w:t xml:space="preserve"> of 98.00% for Model 1 (F1: 0.9804) and 95.09% for Model 2 (</w:t>
+        <w:t xml:space="preserve"> of 98.00% for Model 1 (F1: 0.9804) and 95.</w:t>
+      </w:r>
+      <w:r>
+        <w:rPr>
+          <w:rFonts w:ascii="Arial" w:hAnsi="Arial" w:cs="Arial"/>
+          <w:sz w:val="24"/>
+          <w:szCs w:val="24"/>
+        </w:rPr>
+        <w:t>14</w:t>
+      </w:r>
+      <w:r>
+        <w:rPr>
+          <w:rFonts w:ascii="Arial" w:hAnsi="Arial" w:cs="Arial"/>
+          <w:sz w:val="24"/>
+          <w:szCs w:val="24"/>
+        </w:rPr>
+        <w:t>% for Model 2 (</w:t>
       </w:r>
       <w:proofErr w:type="spellStart"/>
       <w:r>
@@ -3270,15 +3319,7 @@
           <w:sz w:val="24"/>
           <w:szCs w:val="24"/>
         </w:rPr>
-        <w:t xml:space="preserve"> et al. (2016)</w:t>
-      </w:r>
-      <w:r>
-        <w:rPr>
-          <w:rFonts w:ascii="Arial" w:hAnsi="Arial" w:cs="Arial"/>
-          <w:sz w:val="24"/>
-          <w:szCs w:val="24"/>
-        </w:rPr>
-        <w:t xml:space="preserve"> </w:t>
+        <w:t xml:space="preserve"> et al. (2016) </w:t>
       </w:r>
       <w:r>
         <w:rPr>
@@ -3677,15 +3718,7 @@
           <w:sz w:val="24"/>
           <w:szCs w:val="24"/>
         </w:rPr>
-        <w:t>El código fuente está disponible en GitHub:</w:t>
-      </w:r>
-      <w:r>
-        <w:rPr>
-          <w:rFonts w:ascii="Arial" w:hAnsi="Arial" w:cs="Arial"/>
-          <w:sz w:val="24"/>
-          <w:szCs w:val="24"/>
-        </w:rPr>
-        <w:t xml:space="preserve"> </w:t>
+        <w:t xml:space="preserve">El código fuente está disponible en GitHub: </w:t>
       </w:r>
       <w:hyperlink r:id="rId6" w:history="1">
         <w:r>
@@ -3705,14 +3738,6 @@
             <w:szCs w:val="24"/>
           </w:rPr>
           <w:softHyphen/>
-        </w:r>
-        <w:r>
-          <w:rPr>
-            <w:rStyle w:val="Hipervnculo"/>
-            <w:rFonts w:ascii="Arial" w:hAnsi="Arial" w:cs="Arial"/>
-            <w:sz w:val="24"/>
-            <w:szCs w:val="24"/>
-          </w:rPr>
           <w:t>/glycine-vision-dss</w:t>
         </w:r>
       </w:hyperlink>
@@ -3810,14 +3835,6 @@
             <w:szCs w:val="24"/>
           </w:rPr>
           <w:softHyphen/>
-        </w:r>
-        <w:r>
-          <w:rPr>
-            <w:rStyle w:val="Hipervnculo"/>
-            <w:rFonts w:ascii="Arial" w:hAnsi="Arial" w:cs="Arial"/>
-            <w:sz w:val="24"/>
-            <w:szCs w:val="24"/>
-          </w:rPr>
           <w:t>huggingface.co</w:t>
         </w:r>
         <w:r>
@@ -3837,14 +3854,6 @@
             <w:szCs w:val="24"/>
           </w:rPr>
           <w:softHyphen/>
-        </w:r>
-        <w:r>
-          <w:rPr>
-            <w:rStyle w:val="Hipervnculo"/>
-            <w:rFonts w:ascii="Arial" w:hAnsi="Arial" w:cs="Arial"/>
-            <w:sz w:val="24"/>
-            <w:szCs w:val="24"/>
-          </w:rPr>
           <w:t>/</w:t>
         </w:r>
         <w:r>
@@ -3855,14 +3864,6 @@
             <w:szCs w:val="24"/>
           </w:rPr>
           <w:softHyphen/>
-        </w:r>
-        <w:r>
-          <w:rPr>
-            <w:rStyle w:val="Hipervnculo"/>
-            <w:rFonts w:ascii="Arial" w:hAnsi="Arial" w:cs="Arial"/>
-            <w:sz w:val="24"/>
-            <w:szCs w:val="24"/>
-          </w:rPr>
           <w:t>datasets/alejandroramirezucb/</w:t>
         </w:r>
         <w:r>
@@ -3873,14 +3874,6 @@
             <w:szCs w:val="24"/>
           </w:rPr>
           <w:softHyphen/>
-        </w:r>
-        <w:r>
-          <w:rPr>
-            <w:rStyle w:val="Hipervnculo"/>
-            <w:rFonts w:ascii="Arial" w:hAnsi="Arial" w:cs="Arial"/>
-            <w:sz w:val="24"/>
-            <w:szCs w:val="24"/>
-          </w:rPr>
           <w:t>soybean_image_dataset</w:t>
         </w:r>
       </w:hyperlink>
@@ -9324,7 +9317,23 @@
           <w:sz w:val="24"/>
           <w:szCs w:val="24"/>
         </w:rPr>
-        <w:t>La Tabla 5 presenta los resultados del Modelo 2. La exactitud global fue del 95.09% sobre 350 imágenes de prueba (70 por clase), con variación entre clases: desde 90.00% en virales hasta 100.00% en roya y plagas/insectos.</w:t>
+        <w:t>La Tabla 5 presenta los resultados del Modelo 2. La exactitud global fue del 95.</w:t>
+      </w:r>
+      <w:r>
+        <w:rPr>
+          <w:rFonts w:ascii="Arial" w:hAnsi="Arial" w:cs="Arial"/>
+          <w:sz w:val="24"/>
+          <w:szCs w:val="24"/>
+        </w:rPr>
+        <w:t>14</w:t>
+      </w:r>
+      <w:r>
+        <w:rPr>
+          <w:rFonts w:ascii="Arial" w:hAnsi="Arial" w:cs="Arial"/>
+          <w:sz w:val="24"/>
+          <w:szCs w:val="24"/>
+        </w:rPr>
+        <w:t>% sobre 350 imágenes de prueba (70 por clase), con variación entre clases: desde 90.00% en virales hasta 100.00% en roya y plagas/insectos.</w:t>
       </w:r>
     </w:p>
     <w:p>
@@ -9714,7 +9723,19 @@
               <w:rPr>
                 <w:rFonts w:ascii="Arial" w:hAnsi="Arial" w:cs="Arial"/>
               </w:rPr>
-              <w:t>91.18%</w:t>
+              <w:t>91.</w:t>
+            </w:r>
+            <w:r>
+              <w:rPr>
+                <w:rFonts w:ascii="Arial" w:hAnsi="Arial" w:cs="Arial"/>
+              </w:rPr>
+              <w:t>43</w:t>
+            </w:r>
+            <w:r>
+              <w:rPr>
+                <w:rFonts w:ascii="Arial" w:hAnsi="Arial" w:cs="Arial"/>
+              </w:rPr>
+              <w:t>%</w:t>
             </w:r>
           </w:p>
         </w:tc>
@@ -9748,7 +9769,13 @@
               <w:rPr>
                 <w:rFonts w:ascii="Arial" w:hAnsi="Arial" w:cs="Arial"/>
               </w:rPr>
-              <w:t>0.9841</w:t>
+              <w:t>0.984</w:t>
+            </w:r>
+            <w:r>
+              <w:rPr>
+                <w:rFonts w:ascii="Arial" w:hAnsi="Arial" w:cs="Arial"/>
+              </w:rPr>
+              <w:t>6</w:t>
             </w:r>
           </w:p>
         </w:tc>
@@ -9782,7 +9809,13 @@
               <w:rPr>
                 <w:rFonts w:ascii="Arial" w:hAnsi="Arial" w:cs="Arial"/>
               </w:rPr>
-              <w:t>0.9118</w:t>
+              <w:t>0.91</w:t>
+            </w:r>
+            <w:r>
+              <w:rPr>
+                <w:rFonts w:ascii="Arial" w:hAnsi="Arial" w:cs="Arial"/>
+              </w:rPr>
+              <w:t>43</w:t>
             </w:r>
           </w:p>
         </w:tc>
@@ -9816,7 +9849,13 @@
               <w:rPr>
                 <w:rFonts w:ascii="Arial" w:hAnsi="Arial" w:cs="Arial"/>
               </w:rPr>
-              <w:t>0.9466</w:t>
+              <w:t>0.94</w:t>
+            </w:r>
+            <w:r>
+              <w:rPr>
+                <w:rFonts w:ascii="Arial" w:hAnsi="Arial" w:cs="Arial"/>
+              </w:rPr>
+              <w:t>81</w:t>
             </w:r>
           </w:p>
         </w:tc>
@@ -10759,7 +10798,23 @@
                 <w:b/>
                 <w:bCs/>
               </w:rPr>
-              <w:t>95.09%</w:t>
+              <w:t>95.</w:t>
+            </w:r>
+            <w:r>
+              <w:rPr>
+                <w:rFonts w:ascii="Arial" w:hAnsi="Arial" w:cs="Arial"/>
+                <w:b/>
+                <w:bCs/>
+              </w:rPr>
+              <w:t>14</w:t>
+            </w:r>
+            <w:r>
+              <w:rPr>
+                <w:rFonts w:ascii="Arial" w:hAnsi="Arial" w:cs="Arial"/>
+                <w:b/>
+                <w:bCs/>
+              </w:rPr>
+              <w:t>%</w:t>
             </w:r>
           </w:p>
         </w:tc>
@@ -10945,7 +11000,26 @@
           <w:sz w:val="24"/>
           <w:szCs w:val="24"/>
         </w:rPr>
-        <w:t xml:space="preserve">La Tabla 6 muestra la matriz de confusión del Modelo 2. Los principales errores se concentran entre las clases bacterianas y fúngicas, y en virales, donde 5 imágenes se clasificaron erróneamente como fúngicas. </w:t>
+        <w:t>La Tabla 6 muestra la matriz de confusión del Modelo 2.</w:t>
+      </w:r>
+      <w:r>
+        <w:t xml:space="preserve"> </w:t>
+      </w:r>
+      <w:r>
+        <w:rPr>
+          <w:rFonts w:ascii="Arial" w:hAnsi="Arial" w:cs="Arial"/>
+          <w:sz w:val="24"/>
+          <w:szCs w:val="24"/>
+        </w:rPr>
+        <w:t>Los principales errores se concentran en bacterianas (5 clasificadas como fúngicas y 1 como viral) y virales (5 clasificadas como fúngicas y 2 como plagas/insectos)</w:t>
+      </w:r>
+      <w:r>
+        <w:rPr>
+          <w:rFonts w:ascii="Arial" w:hAnsi="Arial" w:cs="Arial"/>
+          <w:sz w:val="24"/>
+          <w:szCs w:val="24"/>
+        </w:rPr>
+        <w:t xml:space="preserve">. </w:t>
       </w:r>
       <w:proofErr w:type="spellStart"/>
       <w:r>
@@ -11036,6 +11110,14 @@
           <w:szCs w:val="24"/>
         </w:rPr>
         <w:t xml:space="preserve"> spot y otras enfermedades fúngicas, especialmente en etapas tempranas, lo que es consistente con estos resultados.</w:t>
+      </w:r>
+      <w:r>
+        <w:rPr>
+          <w:rFonts w:ascii="Arial" w:hAnsi="Arial" w:cs="Arial"/>
+          <w:sz w:val="24"/>
+          <w:szCs w:val="24"/>
+        </w:rPr>
+        <w:t xml:space="preserve"> </w:t>
       </w:r>
     </w:p>
     <w:p>
@@ -11395,7 +11477,13 @@
               <w:rPr>
                 <w:rFonts w:ascii="Arial" w:hAnsi="Arial" w:cs="Arial"/>
               </w:rPr>
-              <w:t>64</w:t>
+              <w:t>6</w:t>
+            </w:r>
+            <w:r>
+              <w:rPr>
+                <w:rFonts w:ascii="Arial" w:hAnsi="Arial" w:cs="Arial"/>
+              </w:rPr>
+              <w:t>4</w:t>
             </w:r>
           </w:p>
         </w:tc>
@@ -11429,7 +11517,7 @@
               <w:rPr>
                 <w:rFonts w:ascii="Arial" w:hAnsi="Arial" w:cs="Arial"/>
               </w:rPr>
-              <w:t>3</w:t>
+              <w:t>5</w:t>
             </w:r>
           </w:p>
         </w:tc>
@@ -11463,7 +11551,7 @@
               <w:rPr>
                 <w:rFonts w:ascii="Arial" w:hAnsi="Arial" w:cs="Arial"/>
               </w:rPr>
-              <w:t>3</w:t>
+              <w:t>0</w:t>
             </w:r>
           </w:p>
         </w:tc>
@@ -11531,7 +11619,7 @@
               <w:rPr>
                 <w:rFonts w:ascii="Arial" w:hAnsi="Arial" w:cs="Arial"/>
               </w:rPr>
-              <w:t>0</w:t>
+              <w:t>1</w:t>
             </w:r>
           </w:p>
         </w:tc>
@@ -11600,7 +11688,7 @@
               <w:rPr>
                 <w:rFonts w:ascii="Arial" w:hAnsi="Arial" w:cs="Arial"/>
               </w:rPr>
-              <w:t>2</w:t>
+              <w:t>1</w:t>
             </w:r>
           </w:p>
         </w:tc>
@@ -11702,7 +11790,7 @@
               <w:rPr>
                 <w:rFonts w:ascii="Arial" w:hAnsi="Arial" w:cs="Arial"/>
               </w:rPr>
-              <w:t>0</w:t>
+              <w:t>2</w:t>
             </w:r>
           </w:p>
         </w:tc>
@@ -11736,7 +11824,7 @@
               <w:rPr>
                 <w:rFonts w:ascii="Arial" w:hAnsi="Arial" w:cs="Arial"/>
               </w:rPr>
-              <w:t>2</w:t>
+              <w:t>1</w:t>
             </w:r>
           </w:p>
         </w:tc>
@@ -12229,7 +12317,7 @@
               <w:rPr>
                 <w:rFonts w:ascii="Arial" w:hAnsi="Arial" w:cs="Arial"/>
               </w:rPr>
-              <w:t>1</w:t>
+              <w:t>0</w:t>
             </w:r>
           </w:p>
         </w:tc>
@@ -12297,7 +12385,7 @@
               <w:rPr>
                 <w:rFonts w:ascii="Arial" w:hAnsi="Arial" w:cs="Arial"/>
               </w:rPr>
-              <w:t>1</w:t>
+              <w:t>0</w:t>
             </w:r>
           </w:p>
         </w:tc>
@@ -12331,7 +12419,7 @@
               <w:rPr>
                 <w:rFonts w:ascii="Arial" w:hAnsi="Arial" w:cs="Arial"/>
               </w:rPr>
-              <w:t>0</w:t>
+              <w:t>2</w:t>
             </w:r>
           </w:p>
         </w:tc>
@@ -12953,6 +13041,8 @@
         <w:jc w:val="both"/>
         <w:rPr>
           <w:rFonts w:ascii="Arial" w:hAnsi="Arial" w:cs="Arial"/>
+          <w:sz w:val="24"/>
+          <w:szCs w:val="24"/>
         </w:rPr>
       </w:pPr>
       <w:r>
@@ -12961,7 +13051,15 @@
           <w:sz w:val="24"/>
           <w:szCs w:val="24"/>
         </w:rPr>
-        <w:t>Las curvas de aprendizaje del Modelo 2 (Figura 4) muestran convergencia paralela entre entrenamiento y validación sin indicios de sobreajuste. La exactitud de entrenamiento (≈92%) es ligeramente superior a la de validación (≈89%) al final de las 70 épocas, y la pérdida desciende de 1.5 a 0.27 en entrenamiento y de 1.4 a 0.33 en validación, patrón que indica una generalización adecuada dentro del dominio de los datos utilizados.</w:t>
+        <w:t xml:space="preserve">Las curvas de aprendizaje del Modelo 2 (Figura 4) muestran convergencia paralela entre entrenamiento y validación sin indicios de sobreajuste. La exactitud de entrenamiento (≈92%) es ligeramente superior a la de validación (≈89%) al final de las 70 épocas, y la pérdida desciende de 1.5 a 0.27 en entrenamiento y de 1.4 a 0.33 en validación, patrón </w:t>
+      </w:r>
+      <w:r>
+        <w:rPr>
+          <w:rFonts w:ascii="Arial" w:hAnsi="Arial" w:cs="Arial"/>
+          <w:sz w:val="24"/>
+          <w:szCs w:val="24"/>
+        </w:rPr>
+        <w:t>que indica una generalización adecuada dentro del dominio de los datos utilizados.</w:t>
       </w:r>
     </w:p>
     <w:p>
@@ -12998,25 +13096,7 @@
           <w:sz w:val="24"/>
           <w:szCs w:val="24"/>
         </w:rPr>
-        <w:t xml:space="preserve"> Machine, el Modelo 2 reportó exactitudes de validación interna de: 0.85 (bacterianas), 0.89 (fúngicas), 0.81 (roya), 0.99 (plagas/insectos) y 0.91 (virales), con 113 muestras/clase. Los resultados del evaluador externo son superiores en todas las clases, lo que se explica porque el evaluador externo utiliza imágenes sobrantes del muestreo de los mismos </w:t>
-      </w:r>
-      <w:proofErr w:type="spellStart"/>
-      <w:r>
-        <w:rPr>
-          <w:rFonts w:ascii="Arial" w:hAnsi="Arial" w:cs="Arial"/>
-          <w:sz w:val="24"/>
-          <w:szCs w:val="24"/>
-        </w:rPr>
-        <w:t>datasets</w:t>
-      </w:r>
-      <w:proofErr w:type="spellEnd"/>
-      <w:r>
-        <w:rPr>
-          <w:rFonts w:ascii="Arial" w:hAnsi="Arial" w:cs="Arial"/>
-          <w:sz w:val="24"/>
-          <w:szCs w:val="24"/>
-        </w:rPr>
-        <w:t xml:space="preserve"> de entrenamiento, mientras que </w:t>
+        <w:t xml:space="preserve"> Machine, el Modelo 2 reportó exactitudes de validación interna de: 0.85 (bacterianas), 0.89 (fúngicas), 0.81 (roya), 0.99 (plagas/insectos) y 0.91 (virales), con 113 muestras/clase. Las métricas del script de evaluación propio (evaluate_models.py) son superiores en todas las clases, lo que se explica porque este script evalúa con imágenes sobrantes del muestreo (distintas a las usadas en entrenamiento) mientras que </w:t>
       </w:r>
       <w:proofErr w:type="spellStart"/>
       <w:r>
@@ -13034,17 +13114,8 @@
           <w:sz w:val="24"/>
           <w:szCs w:val="24"/>
         </w:rPr>
-        <w:t xml:space="preserve"> Machine evalúa con el 20% del conjunto de entrenamiento en su validación interna.</w:t>
-      </w:r>
-    </w:p>
-    <w:p>
-      <w:pPr>
-        <w:spacing w:after="120" w:line="360" w:lineRule="auto"/>
-        <w:jc w:val="both"/>
-        <w:rPr>
-          <w:rFonts w:ascii="Arial" w:hAnsi="Arial" w:cs="Arial"/>
-        </w:rPr>
-      </w:pPr>
+        <w:t xml:space="preserve"> Machine calcula su validación interna usando el 20% del mismo conjunto de entrenamiento.</w:t>
+      </w:r>
     </w:p>
     <w:p>
       <w:pPr>
@@ -13115,7 +13186,23 @@
           <w:sz w:val="24"/>
           <w:szCs w:val="24"/>
         </w:rPr>
-        <w:t xml:space="preserve"> fitosanitario digital de enfermedades en soya, con una exactitud del 98.00% en la clasificación sana/enferma y del 95.09% en la identificación del tipo de patógeno sobre conjuntos de prueba independientes. </w:t>
+        <w:t xml:space="preserve"> fitosanitario digital de enfermedades en soya, con una exactitud del 98.00% en la clasificación sana/enferma y del 95.</w:t>
+      </w:r>
+      <w:r>
+        <w:rPr>
+          <w:rFonts w:ascii="Arial" w:hAnsi="Arial" w:cs="Arial"/>
+          <w:sz w:val="24"/>
+          <w:szCs w:val="24"/>
+        </w:rPr>
+        <w:t>14</w:t>
+      </w:r>
+      <w:r>
+        <w:rPr>
+          <w:rFonts w:ascii="Arial" w:hAnsi="Arial" w:cs="Arial"/>
+          <w:sz w:val="24"/>
+          <w:szCs w:val="24"/>
+        </w:rPr>
+        <w:t xml:space="preserve">% en la identificación del tipo de patógeno sobre conjuntos de prueba independientes. </w:t>
       </w:r>
       <w:r>
         <w:rPr>
@@ -13131,16 +13218,7 @@
           <w:sz w:val="24"/>
           <w:szCs w:val="24"/>
         </w:rPr>
-        <w:t xml:space="preserve">en cascada permite tomar decisiones de manejo </w:t>
-      </w:r>
-      <w:r>
-        <w:rPr>
-          <w:rFonts w:ascii="Arial" w:hAnsi="Arial" w:cs="Arial"/>
-          <w:sz w:val="24"/>
-          <w:szCs w:val="24"/>
-        </w:rPr>
-        <w:lastRenderedPageBreak/>
-        <w:t>diferenciadas según</w:t>
+        <w:t>en cascada permite tomar decisiones de manejo diferenciadas según</w:t>
       </w:r>
       <w:r>
         <w:rPr>
@@ -13175,6 +13253,7 @@
           <w:sz w:val="24"/>
           <w:szCs w:val="24"/>
         </w:rPr>
+        <w:lastRenderedPageBreak/>
         <w:t>La estrategia de combinar imágenes de campo (ASDID) con imágenes de fondo controlado (</w:t>
       </w:r>
       <w:proofErr w:type="spellStart"/>
@@ -13284,7 +13363,23 @@
           <w:sz w:val="24"/>
           <w:szCs w:val="24"/>
         </w:rPr>
-        <w:t xml:space="preserve">Como limitación principal, se identificó que el rendimiento del Modelo 2 en enfermedades bacterianas es el más bajo (91.18%), posiblemente por la similitud visual con enfermedades fúngicas en etapas tempranas. A futuro, se podría explorar técnicas de data </w:t>
+        <w:t>Como limitación principal, se identificó que el rendimiento del Modelo 2 en enfermedades bacterianas es el más bajo (91.</w:t>
+      </w:r>
+      <w:r>
+        <w:rPr>
+          <w:rFonts w:ascii="Arial" w:hAnsi="Arial" w:cs="Arial"/>
+          <w:sz w:val="24"/>
+          <w:szCs w:val="24"/>
+        </w:rPr>
+        <w:t>43</w:t>
+      </w:r>
+      <w:r>
+        <w:rPr>
+          <w:rFonts w:ascii="Arial" w:hAnsi="Arial" w:cs="Arial"/>
+          <w:sz w:val="24"/>
+          <w:szCs w:val="24"/>
+        </w:rPr>
+        <w:t xml:space="preserve">%), posiblemente por la similitud visual con enfermedades fúngicas en etapas tempranas. A futuro, se podría explorar técnicas de data </w:t>
       </w:r>
       <w:proofErr w:type="spellStart"/>
       <w:r>
@@ -14427,7 +14522,6 @@
           <w:sz w:val="24"/>
           <w:szCs w:val="24"/>
         </w:rPr>
-        <w:lastRenderedPageBreak/>
         <w:t>Conference</w:t>
       </w:r>
       <w:proofErr w:type="spellEnd"/>
@@ -14520,6 +14614,7 @@
           <w:sz w:val="24"/>
           <w:szCs w:val="24"/>
         </w:rPr>
+        <w:lastRenderedPageBreak/>
         <w:t xml:space="preserve">Chen, J., Zhang, D., &amp; </w:t>
       </w:r>
       <w:proofErr w:type="spellStart"/>
@@ -16704,14 +16799,6 @@
           <w:szCs w:val="24"/>
         </w:rPr>
         <w:t xml:space="preserve"> Vallejos es estudiante de Ingeniería de Software de la Universidad Católica Boliviana, sede Santa Cruz. </w:t>
-      </w:r>
-      <w:r>
-        <w:rPr>
-          <w:rFonts w:ascii="Arial" w:hAnsi="Arial" w:cs="Arial"/>
-          <w:sz w:val="24"/>
-          <w:szCs w:val="24"/>
-        </w:rPr>
-        <w:t>Se ha desarrollado el siguiente documento para un examen de la asignatura de Inteligencia Artificial.</w:t>
       </w:r>
     </w:p>
     <w:p>

</xml_diff>

<commit_message>
docs: actualizando articulo cientifico
</commit_message>
<xml_diff>
--- a/Articulo Cientifico.docx
+++ b/Articulo Cientifico.docx
@@ -73,7 +73,27 @@
           <w:sz w:val="28"/>
           <w:szCs w:val="24"/>
         </w:rPr>
-        <w:t>Detección de enfermedades y severidad foliar en soya mediante aprendizaje profundo en dispositivos móviles</w:t>
+        <w:t xml:space="preserve">Detección de enfermedades y severidad foliar en soya mediante </w:t>
+      </w:r>
+      <w:r>
+        <w:rPr>
+          <w:rFonts w:ascii="Arial" w:hAnsi="Arial" w:cs="Arial"/>
+          <w:b/>
+          <w:spacing w:val="-3"/>
+          <w:sz w:val="28"/>
+          <w:szCs w:val="24"/>
+        </w:rPr>
+        <w:t>redes neuronales</w:t>
+      </w:r>
+      <w:r>
+        <w:rPr>
+          <w:rFonts w:ascii="Arial" w:hAnsi="Arial" w:cs="Arial"/>
+          <w:b/>
+          <w:spacing w:val="-3"/>
+          <w:sz w:val="28"/>
+          <w:szCs w:val="24"/>
+        </w:rPr>
+        <w:t xml:space="preserve"> en dispositivos móviles</w:t>
       </w:r>
     </w:p>
     <w:p>
@@ -100,7 +120,7 @@
           <w:sz w:val="24"/>
           <w:szCs w:val="24"/>
         </w:rPr>
-        <w:t>Soybean</w:t>
+        <w:t>Detection</w:t>
       </w:r>
       <w:proofErr w:type="spellEnd"/>
       <w:r>
@@ -124,7 +144,7 @@
           <w:sz w:val="24"/>
           <w:szCs w:val="24"/>
         </w:rPr>
-        <w:t>leaf</w:t>
+        <w:t>of</w:t>
       </w:r>
       <w:proofErr w:type="spellEnd"/>
       <w:r>
@@ -148,7 +168,7 @@
           <w:sz w:val="24"/>
           <w:szCs w:val="24"/>
         </w:rPr>
-        <w:t>disease</w:t>
+        <w:t>diseases</w:t>
       </w:r>
       <w:proofErr w:type="spellEnd"/>
       <w:r>
@@ -160,7 +180,7 @@
           <w:sz w:val="24"/>
           <w:szCs w:val="24"/>
         </w:rPr>
-        <w:t xml:space="preserve"> </w:t>
+        <w:t xml:space="preserve"> and foliar </w:t>
       </w:r>
       <w:proofErr w:type="spellStart"/>
       <w:r>
@@ -172,7 +192,7 @@
           <w:sz w:val="24"/>
           <w:szCs w:val="24"/>
         </w:rPr>
-        <w:t>detection</w:t>
+        <w:t>severity</w:t>
       </w:r>
       <w:proofErr w:type="spellEnd"/>
       <w:r>
@@ -184,7 +204,7 @@
           <w:sz w:val="24"/>
           <w:szCs w:val="24"/>
         </w:rPr>
-        <w:t xml:space="preserve"> and </w:t>
+        <w:t xml:space="preserve"> in </w:t>
       </w:r>
       <w:proofErr w:type="spellStart"/>
       <w:r>
@@ -196,7 +216,7 @@
           <w:sz w:val="24"/>
           <w:szCs w:val="24"/>
         </w:rPr>
-        <w:t>severity</w:t>
+        <w:t>soybeans</w:t>
       </w:r>
       <w:proofErr w:type="spellEnd"/>
       <w:r>
@@ -220,7 +240,7 @@
           <w:sz w:val="24"/>
           <w:szCs w:val="24"/>
         </w:rPr>
-        <w:t>estimation</w:t>
+        <w:t>using</w:t>
       </w:r>
       <w:proofErr w:type="spellEnd"/>
       <w:r>
@@ -232,7 +252,7 @@
           <w:sz w:val="24"/>
           <w:szCs w:val="24"/>
         </w:rPr>
-        <w:t xml:space="preserve"> </w:t>
+        <w:t xml:space="preserve"> neural </w:t>
       </w:r>
       <w:proofErr w:type="spellStart"/>
       <w:r>
@@ -244,55 +264,7 @@
           <w:sz w:val="24"/>
           <w:szCs w:val="24"/>
         </w:rPr>
-        <w:t>using</w:t>
-      </w:r>
-      <w:proofErr w:type="spellEnd"/>
-      <w:r>
-        <w:rPr>
-          <w:rFonts w:ascii="Arial" w:hAnsi="Arial" w:cs="Arial"/>
-          <w:i/>
-          <w:iCs/>
-          <w:spacing w:val="-3"/>
-          <w:sz w:val="24"/>
-          <w:szCs w:val="24"/>
-        </w:rPr>
-        <w:t xml:space="preserve"> </w:t>
-      </w:r>
-      <w:proofErr w:type="spellStart"/>
-      <w:r>
-        <w:rPr>
-          <w:rFonts w:ascii="Arial" w:hAnsi="Arial" w:cs="Arial"/>
-          <w:i/>
-          <w:iCs/>
-          <w:spacing w:val="-3"/>
-          <w:sz w:val="24"/>
-          <w:szCs w:val="24"/>
-        </w:rPr>
-        <w:t>deep</w:t>
-      </w:r>
-      <w:proofErr w:type="spellEnd"/>
-      <w:r>
-        <w:rPr>
-          <w:rFonts w:ascii="Arial" w:hAnsi="Arial" w:cs="Arial"/>
-          <w:i/>
-          <w:iCs/>
-          <w:spacing w:val="-3"/>
-          <w:sz w:val="24"/>
-          <w:szCs w:val="24"/>
-        </w:rPr>
-        <w:t xml:space="preserve"> </w:t>
-      </w:r>
-      <w:proofErr w:type="spellStart"/>
-      <w:r>
-        <w:rPr>
-          <w:rFonts w:ascii="Arial" w:hAnsi="Arial" w:cs="Arial"/>
-          <w:i/>
-          <w:iCs/>
-          <w:spacing w:val="-3"/>
-          <w:sz w:val="24"/>
-          <w:szCs w:val="24"/>
-        </w:rPr>
-        <w:t>learning</w:t>
+        <w:t>networks</w:t>
       </w:r>
       <w:proofErr w:type="spellEnd"/>
       <w:r>
@@ -5691,6 +5663,7 @@
           <w:rFonts w:ascii="Arial" w:hAnsi="Arial" w:cs="Arial"/>
           <w:i/>
           <w:iCs/>
+          <w:noProof/>
           <w:lang w:val="es-MX"/>
         </w:rPr>
         <w:lastRenderedPageBreak/>
@@ -8264,23 +8237,7 @@
           <w:rFonts w:ascii="Arial" w:hAnsi="Arial" w:cs="Arial"/>
           <w:lang w:val="es-US"/>
         </w:rPr>
-        <w:t xml:space="preserve">Los resultados muestran que la descomposición del problema en segmentación hoja–fondo, clasificación en cascada y estimación de severidad por color produce un sistema de diagnóstico robusto y, a la vez, interpretable. A </w:t>
-      </w:r>
-      <w:proofErr w:type="gramStart"/>
-      <w:r>
-        <w:rPr>
-          <w:rFonts w:ascii="Arial" w:hAnsi="Arial" w:cs="Arial"/>
-          <w:lang w:val="es-US"/>
-        </w:rPr>
-        <w:t>continuación</w:t>
-      </w:r>
-      <w:proofErr w:type="gramEnd"/>
-      <w:r>
-        <w:rPr>
-          <w:rFonts w:ascii="Arial" w:hAnsi="Arial" w:cs="Arial"/>
-          <w:lang w:val="es-US"/>
-        </w:rPr>
-        <w:t xml:space="preserve"> se discuten su validez para el contexto regional, su robustez frente a la captura no controlada y su relación con la literatura.</w:t>
+        <w:t>Los resultados muestran que la descomposición del problema en segmentación hoja–fondo, clasificación en cascada y estimación de severidad por color produce un sistema de diagnóstico robusto y, a la vez, interpretable. A continuación se discuten su validez para el contexto regional, su robustez frente a la captura no controlada y su relación con la literatura.</w:t>
       </w:r>
     </w:p>
     <w:p>
@@ -10153,76 +10110,18 @@
         </w:rPr>
         <w:t xml:space="preserve">, 6, 1227950. </w:t>
       </w:r>
-      <w:r>
-        <w:rPr>
-          <w:rFonts w:ascii="Arial" w:hAnsi="Arial" w:cs="Arial"/>
-          <w:bCs/>
-          <w:color w:val="000000" w:themeColor="text1"/>
-          <w:sz w:val="24"/>
-          <w:szCs w:val="24"/>
-        </w:rPr>
-        <w:fldChar w:fldCharType="begin"/>
-      </w:r>
-      <w:r>
-        <w:rPr>
-          <w:rFonts w:ascii="Arial" w:hAnsi="Arial" w:cs="Arial"/>
-          <w:bCs/>
-          <w:color w:val="000000" w:themeColor="text1"/>
-          <w:sz w:val="24"/>
-          <w:szCs w:val="24"/>
-        </w:rPr>
-        <w:instrText xml:space="preserve"> HYPERLINK "</w:instrText>
-      </w:r>
-      <w:r>
-        <w:rPr>
-          <w:rFonts w:ascii="Arial" w:hAnsi="Arial" w:cs="Arial"/>
-          <w:bCs/>
-          <w:color w:val="000000" w:themeColor="text1"/>
-          <w:sz w:val="24"/>
-          <w:szCs w:val="24"/>
-        </w:rPr>
-        <w:instrText>https://doi.org/10.3389/frai.2023.1227950</w:instrText>
-      </w:r>
-      <w:r>
-        <w:rPr>
-          <w:rFonts w:ascii="Arial" w:hAnsi="Arial" w:cs="Arial"/>
-          <w:bCs/>
-          <w:color w:val="000000" w:themeColor="text1"/>
-          <w:sz w:val="24"/>
-          <w:szCs w:val="24"/>
-        </w:rPr>
-        <w:instrText xml:space="preserve">" </w:instrText>
-      </w:r>
-      <w:r>
-        <w:rPr>
-          <w:rFonts w:ascii="Arial" w:hAnsi="Arial" w:cs="Arial"/>
-          <w:bCs/>
-          <w:color w:val="000000" w:themeColor="text1"/>
-          <w:sz w:val="24"/>
-          <w:szCs w:val="24"/>
-        </w:rPr>
-        <w:fldChar w:fldCharType="separate"/>
-      </w:r>
-      <w:r>
-        <w:rPr>
-          <w:rStyle w:val="Hipervnculo"/>
-          <w:rFonts w:ascii="Arial" w:hAnsi="Arial" w:cs="Arial"/>
-          <w:bCs/>
-          <w:sz w:val="24"/>
-          <w:szCs w:val="24"/>
-        </w:rPr>
-        <w:t>https://doi.org/10.3389/frai.2023.1227950</w:t>
-      </w:r>
-      <w:r>
-        <w:rPr>
-          <w:rFonts w:ascii="Arial" w:hAnsi="Arial" w:cs="Arial"/>
-          <w:bCs/>
-          <w:color w:val="000000" w:themeColor="text1"/>
-          <w:sz w:val="24"/>
-          <w:szCs w:val="24"/>
-        </w:rPr>
-        <w:fldChar w:fldCharType="end"/>
-      </w:r>
+      <w:hyperlink r:id="rId23" w:history="1">
+        <w:r>
+          <w:rPr>
+            <w:rStyle w:val="Hipervnculo"/>
+            <w:rFonts w:ascii="Arial" w:hAnsi="Arial" w:cs="Arial"/>
+            <w:bCs/>
+            <w:sz w:val="24"/>
+            <w:szCs w:val="24"/>
+          </w:rPr>
+          <w:t>https://doi.org/10.3389/frai.2023.1227950</w:t>
+        </w:r>
+      </w:hyperlink>
     </w:p>
     <w:p>
       <w:pPr>
@@ -10588,76 +10487,18 @@
         </w:rPr>
         <w:t xml:space="preserve">, 203, 107449. </w:t>
       </w:r>
-      <w:r>
-        <w:rPr>
-          <w:rFonts w:ascii="Arial" w:hAnsi="Arial" w:cs="Arial"/>
-          <w:bCs/>
-          <w:color w:val="000000" w:themeColor="text1"/>
-          <w:sz w:val="24"/>
-          <w:szCs w:val="24"/>
-        </w:rPr>
-        <w:fldChar w:fldCharType="begin"/>
-      </w:r>
-      <w:r>
-        <w:rPr>
-          <w:rFonts w:ascii="Arial" w:hAnsi="Arial" w:cs="Arial"/>
-          <w:bCs/>
-          <w:color w:val="000000" w:themeColor="text1"/>
-          <w:sz w:val="24"/>
-          <w:szCs w:val="24"/>
-        </w:rPr>
-        <w:instrText xml:space="preserve"> HYPERLINK "</w:instrText>
-      </w:r>
-      <w:r>
-        <w:rPr>
-          <w:rFonts w:ascii="Arial" w:hAnsi="Arial" w:cs="Arial"/>
-          <w:bCs/>
-          <w:color w:val="000000" w:themeColor="text1"/>
-          <w:sz w:val="24"/>
-          <w:szCs w:val="24"/>
-        </w:rPr>
-        <w:instrText>https://doi.org/10.1016/j.compag.2022.107449</w:instrText>
-      </w:r>
-      <w:r>
-        <w:rPr>
-          <w:rFonts w:ascii="Arial" w:hAnsi="Arial" w:cs="Arial"/>
-          <w:bCs/>
-          <w:color w:val="000000" w:themeColor="text1"/>
-          <w:sz w:val="24"/>
-          <w:szCs w:val="24"/>
-        </w:rPr>
-        <w:instrText xml:space="preserve">" </w:instrText>
-      </w:r>
-      <w:r>
-        <w:rPr>
-          <w:rFonts w:ascii="Arial" w:hAnsi="Arial" w:cs="Arial"/>
-          <w:bCs/>
-          <w:color w:val="000000" w:themeColor="text1"/>
-          <w:sz w:val="24"/>
-          <w:szCs w:val="24"/>
-        </w:rPr>
-        <w:fldChar w:fldCharType="separate"/>
-      </w:r>
-      <w:r>
-        <w:rPr>
-          <w:rStyle w:val="Hipervnculo"/>
-          <w:rFonts w:ascii="Arial" w:hAnsi="Arial" w:cs="Arial"/>
-          <w:bCs/>
-          <w:sz w:val="24"/>
-          <w:szCs w:val="24"/>
-        </w:rPr>
-        <w:t>https://doi.org/10.1016/j.compag.2022.107449</w:t>
-      </w:r>
-      <w:r>
-        <w:rPr>
-          <w:rFonts w:ascii="Arial" w:hAnsi="Arial" w:cs="Arial"/>
-          <w:bCs/>
-          <w:color w:val="000000" w:themeColor="text1"/>
-          <w:sz w:val="24"/>
-          <w:szCs w:val="24"/>
-        </w:rPr>
-        <w:fldChar w:fldCharType="end"/>
-      </w:r>
+      <w:hyperlink r:id="rId24" w:history="1">
+        <w:r>
+          <w:rPr>
+            <w:rStyle w:val="Hipervnculo"/>
+            <w:rFonts w:ascii="Arial" w:hAnsi="Arial" w:cs="Arial"/>
+            <w:bCs/>
+            <w:sz w:val="24"/>
+            <w:szCs w:val="24"/>
+          </w:rPr>
+          <w:t>https://doi.org/10.1016/j.compag.2022.107449</w:t>
+        </w:r>
+      </w:hyperlink>
     </w:p>
     <w:p>
       <w:pPr>
@@ -10955,29 +10796,7 @@
           <w:sz w:val="24"/>
           <w:szCs w:val="24"/>
         </w:rPr>
-        <w:t xml:space="preserve"> </w:t>
-      </w:r>
-      <w:proofErr w:type="spellStart"/>
-      <w:r>
-        <w:rPr>
-          <w:rFonts w:ascii="Arial" w:hAnsi="Arial" w:cs="Arial"/>
-          <w:bCs/>
-          <w:color w:val="000000" w:themeColor="text1"/>
-          <w:sz w:val="24"/>
-          <w:szCs w:val="24"/>
-        </w:rPr>
-        <w:t>of</w:t>
-      </w:r>
-      <w:proofErr w:type="spellEnd"/>
-      <w:r>
-        <w:rPr>
-          <w:rFonts w:ascii="Arial" w:hAnsi="Arial" w:cs="Arial"/>
-          <w:bCs/>
-          <w:color w:val="000000" w:themeColor="text1"/>
-          <w:sz w:val="24"/>
-          <w:szCs w:val="24"/>
-        </w:rPr>
-        <w:t xml:space="preserve"> </w:t>
+        <w:t xml:space="preserve"> of </w:t>
       </w:r>
       <w:proofErr w:type="spellStart"/>
       <w:r>
@@ -11001,76 +10820,18 @@
         </w:rPr>
         <w:t xml:space="preserve">, 173(1), e70051. </w:t>
       </w:r>
-      <w:r>
-        <w:rPr>
-          <w:rFonts w:ascii="Arial" w:hAnsi="Arial" w:cs="Arial"/>
-          <w:bCs/>
-          <w:color w:val="000000" w:themeColor="text1"/>
-          <w:sz w:val="24"/>
-          <w:szCs w:val="24"/>
-        </w:rPr>
-        <w:fldChar w:fldCharType="begin"/>
-      </w:r>
-      <w:r>
-        <w:rPr>
-          <w:rFonts w:ascii="Arial" w:hAnsi="Arial" w:cs="Arial"/>
-          <w:bCs/>
-          <w:color w:val="000000" w:themeColor="text1"/>
-          <w:sz w:val="24"/>
-          <w:szCs w:val="24"/>
-        </w:rPr>
-        <w:instrText xml:space="preserve"> HYPERLINK "</w:instrText>
-      </w:r>
-      <w:r>
-        <w:rPr>
-          <w:rFonts w:ascii="Arial" w:hAnsi="Arial" w:cs="Arial"/>
-          <w:bCs/>
-          <w:color w:val="000000" w:themeColor="text1"/>
-          <w:sz w:val="24"/>
-          <w:szCs w:val="24"/>
-        </w:rPr>
-        <w:instrText>https://doi.org/10.1111/jph.70051</w:instrText>
-      </w:r>
-      <w:r>
-        <w:rPr>
-          <w:rFonts w:ascii="Arial" w:hAnsi="Arial" w:cs="Arial"/>
-          <w:bCs/>
-          <w:color w:val="000000" w:themeColor="text1"/>
-          <w:sz w:val="24"/>
-          <w:szCs w:val="24"/>
-        </w:rPr>
-        <w:instrText xml:space="preserve">" </w:instrText>
-      </w:r>
-      <w:r>
-        <w:rPr>
-          <w:rFonts w:ascii="Arial" w:hAnsi="Arial" w:cs="Arial"/>
-          <w:bCs/>
-          <w:color w:val="000000" w:themeColor="text1"/>
-          <w:sz w:val="24"/>
-          <w:szCs w:val="24"/>
-        </w:rPr>
-        <w:fldChar w:fldCharType="separate"/>
-      </w:r>
-      <w:r>
-        <w:rPr>
-          <w:rStyle w:val="Hipervnculo"/>
-          <w:rFonts w:ascii="Arial" w:hAnsi="Arial" w:cs="Arial"/>
-          <w:bCs/>
-          <w:sz w:val="24"/>
-          <w:szCs w:val="24"/>
-        </w:rPr>
-        <w:t>https://doi.org/10.1111/jph.70051</w:t>
-      </w:r>
-      <w:r>
-        <w:rPr>
-          <w:rFonts w:ascii="Arial" w:hAnsi="Arial" w:cs="Arial"/>
-          <w:bCs/>
-          <w:color w:val="000000" w:themeColor="text1"/>
-          <w:sz w:val="24"/>
-          <w:szCs w:val="24"/>
-        </w:rPr>
-        <w:fldChar w:fldCharType="end"/>
-      </w:r>
+      <w:hyperlink r:id="rId25" w:history="1">
+        <w:r>
+          <w:rPr>
+            <w:rStyle w:val="Hipervnculo"/>
+            <w:rFonts w:ascii="Arial" w:hAnsi="Arial" w:cs="Arial"/>
+            <w:bCs/>
+            <w:sz w:val="24"/>
+            <w:szCs w:val="24"/>
+          </w:rPr>
+          <w:t>https://doi.org/10.1111/jph.70051</w:t>
+        </w:r>
+      </w:hyperlink>
     </w:p>
     <w:p>
       <w:pPr>
@@ -11370,76 +11131,18 @@
         </w:rPr>
         <w:t xml:space="preserve"> Lancet, 327(8476), 307–310. </w:t>
       </w:r>
-      <w:r>
-        <w:rPr>
-          <w:rFonts w:ascii="Arial" w:hAnsi="Arial" w:cs="Arial"/>
-          <w:bCs/>
-          <w:color w:val="000000" w:themeColor="text1"/>
-          <w:sz w:val="24"/>
-          <w:szCs w:val="24"/>
-        </w:rPr>
-        <w:fldChar w:fldCharType="begin"/>
-      </w:r>
-      <w:r>
-        <w:rPr>
-          <w:rFonts w:ascii="Arial" w:hAnsi="Arial" w:cs="Arial"/>
-          <w:bCs/>
-          <w:color w:val="000000" w:themeColor="text1"/>
-          <w:sz w:val="24"/>
-          <w:szCs w:val="24"/>
-        </w:rPr>
-        <w:instrText xml:space="preserve"> HYPERLINK "</w:instrText>
-      </w:r>
-      <w:r>
-        <w:rPr>
-          <w:rFonts w:ascii="Arial" w:hAnsi="Arial" w:cs="Arial"/>
-          <w:bCs/>
-          <w:color w:val="000000" w:themeColor="text1"/>
-          <w:sz w:val="24"/>
-          <w:szCs w:val="24"/>
-        </w:rPr>
-        <w:instrText>https://doi.org/10.1016/S0140-6736(86)90837-8</w:instrText>
-      </w:r>
-      <w:r>
-        <w:rPr>
-          <w:rFonts w:ascii="Arial" w:hAnsi="Arial" w:cs="Arial"/>
-          <w:bCs/>
-          <w:color w:val="000000" w:themeColor="text1"/>
-          <w:sz w:val="24"/>
-          <w:szCs w:val="24"/>
-        </w:rPr>
-        <w:instrText xml:space="preserve">" </w:instrText>
-      </w:r>
-      <w:r>
-        <w:rPr>
-          <w:rFonts w:ascii="Arial" w:hAnsi="Arial" w:cs="Arial"/>
-          <w:bCs/>
-          <w:color w:val="000000" w:themeColor="text1"/>
-          <w:sz w:val="24"/>
-          <w:szCs w:val="24"/>
-        </w:rPr>
-        <w:fldChar w:fldCharType="separate"/>
-      </w:r>
-      <w:r>
-        <w:rPr>
-          <w:rStyle w:val="Hipervnculo"/>
-          <w:rFonts w:ascii="Arial" w:hAnsi="Arial" w:cs="Arial"/>
-          <w:bCs/>
-          <w:sz w:val="24"/>
-          <w:szCs w:val="24"/>
-        </w:rPr>
-        <w:t>https://doi.org/10.1016/S0140-6736(86)90837-8</w:t>
-      </w:r>
-      <w:r>
-        <w:rPr>
-          <w:rFonts w:ascii="Arial" w:hAnsi="Arial" w:cs="Arial"/>
-          <w:bCs/>
-          <w:color w:val="000000" w:themeColor="text1"/>
-          <w:sz w:val="24"/>
-          <w:szCs w:val="24"/>
-        </w:rPr>
-        <w:fldChar w:fldCharType="end"/>
-      </w:r>
+      <w:hyperlink r:id="rId26" w:history="1">
+        <w:r>
+          <w:rPr>
+            <w:rStyle w:val="Hipervnculo"/>
+            <w:rFonts w:ascii="Arial" w:hAnsi="Arial" w:cs="Arial"/>
+            <w:bCs/>
+            <w:sz w:val="24"/>
+            <w:szCs w:val="24"/>
+          </w:rPr>
+          <w:t>https://doi.org/10.1016/S0140-6736(86)90837-8</w:t>
+        </w:r>
+      </w:hyperlink>
     </w:p>
     <w:p>
       <w:pPr>
@@ -11903,76 +11606,18 @@
         </w:rPr>
         <w:t xml:space="preserve">, 47(1), 25–42. </w:t>
       </w:r>
-      <w:r>
-        <w:rPr>
-          <w:rFonts w:ascii="Arial" w:hAnsi="Arial" w:cs="Arial"/>
-          <w:bCs/>
-          <w:color w:val="000000" w:themeColor="text1"/>
-          <w:sz w:val="24"/>
-          <w:szCs w:val="24"/>
-        </w:rPr>
-        <w:fldChar w:fldCharType="begin"/>
-      </w:r>
-      <w:r>
-        <w:rPr>
-          <w:rFonts w:ascii="Arial" w:hAnsi="Arial" w:cs="Arial"/>
-          <w:bCs/>
-          <w:color w:val="000000" w:themeColor="text1"/>
-          <w:sz w:val="24"/>
-          <w:szCs w:val="24"/>
-        </w:rPr>
-        <w:instrText xml:space="preserve"> HYPERLINK "</w:instrText>
-      </w:r>
-      <w:r>
-        <w:rPr>
-          <w:rFonts w:ascii="Arial" w:hAnsi="Arial" w:cs="Arial"/>
-          <w:bCs/>
-          <w:color w:val="000000" w:themeColor="text1"/>
-          <w:sz w:val="24"/>
-          <w:szCs w:val="24"/>
-        </w:rPr>
-        <w:instrText>https://doi.org/10.1007/s40858-021-00439-z</w:instrText>
-      </w:r>
-      <w:r>
-        <w:rPr>
-          <w:rFonts w:ascii="Arial" w:hAnsi="Arial" w:cs="Arial"/>
-          <w:bCs/>
-          <w:color w:val="000000" w:themeColor="text1"/>
-          <w:sz w:val="24"/>
-          <w:szCs w:val="24"/>
-        </w:rPr>
-        <w:instrText xml:space="preserve">" </w:instrText>
-      </w:r>
-      <w:r>
-        <w:rPr>
-          <w:rFonts w:ascii="Arial" w:hAnsi="Arial" w:cs="Arial"/>
-          <w:bCs/>
-          <w:color w:val="000000" w:themeColor="text1"/>
-          <w:sz w:val="24"/>
-          <w:szCs w:val="24"/>
-        </w:rPr>
-        <w:fldChar w:fldCharType="separate"/>
-      </w:r>
-      <w:r>
-        <w:rPr>
-          <w:rStyle w:val="Hipervnculo"/>
-          <w:rFonts w:ascii="Arial" w:hAnsi="Arial" w:cs="Arial"/>
-          <w:bCs/>
-          <w:sz w:val="24"/>
-          <w:szCs w:val="24"/>
-        </w:rPr>
-        <w:t>https://doi.org/10.1007/s40858-021-00439-z</w:t>
-      </w:r>
-      <w:r>
-        <w:rPr>
-          <w:rFonts w:ascii="Arial" w:hAnsi="Arial" w:cs="Arial"/>
-          <w:bCs/>
-          <w:color w:val="000000" w:themeColor="text1"/>
-          <w:sz w:val="24"/>
-          <w:szCs w:val="24"/>
-        </w:rPr>
-        <w:fldChar w:fldCharType="end"/>
-      </w:r>
+      <w:hyperlink r:id="rId27" w:history="1">
+        <w:r>
+          <w:rPr>
+            <w:rStyle w:val="Hipervnculo"/>
+            <w:rFonts w:ascii="Arial" w:hAnsi="Arial" w:cs="Arial"/>
+            <w:bCs/>
+            <w:sz w:val="24"/>
+            <w:szCs w:val="24"/>
+          </w:rPr>
+          <w:t>https://doi.org/10.1007/s40858-021-00439-z</w:t>
+        </w:r>
+      </w:hyperlink>
     </w:p>
     <w:p>
       <w:pPr>
@@ -12436,76 +12081,18 @@
         </w:rPr>
         <w:t xml:space="preserve">, 192, 106542. </w:t>
       </w:r>
-      <w:r>
-        <w:rPr>
-          <w:rFonts w:ascii="Arial" w:hAnsi="Arial" w:cs="Arial"/>
-          <w:bCs/>
-          <w:color w:val="000000" w:themeColor="text1"/>
-          <w:sz w:val="24"/>
-          <w:szCs w:val="24"/>
-        </w:rPr>
-        <w:fldChar w:fldCharType="begin"/>
-      </w:r>
-      <w:r>
-        <w:rPr>
-          <w:rFonts w:ascii="Arial" w:hAnsi="Arial" w:cs="Arial"/>
-          <w:bCs/>
-          <w:color w:val="000000" w:themeColor="text1"/>
-          <w:sz w:val="24"/>
-          <w:szCs w:val="24"/>
-        </w:rPr>
-        <w:instrText xml:space="preserve"> HYPERLINK "</w:instrText>
-      </w:r>
-      <w:r>
-        <w:rPr>
-          <w:rFonts w:ascii="Arial" w:hAnsi="Arial" w:cs="Arial"/>
-          <w:bCs/>
-          <w:color w:val="000000" w:themeColor="text1"/>
-          <w:sz w:val="24"/>
-          <w:szCs w:val="24"/>
-        </w:rPr>
-        <w:instrText>https://doi.org/10.1016/j.compag.2021.106542</w:instrText>
-      </w:r>
-      <w:r>
-        <w:rPr>
-          <w:rFonts w:ascii="Arial" w:hAnsi="Arial" w:cs="Arial"/>
-          <w:bCs/>
-          <w:color w:val="000000" w:themeColor="text1"/>
-          <w:sz w:val="24"/>
-          <w:szCs w:val="24"/>
-        </w:rPr>
-        <w:instrText xml:space="preserve">" </w:instrText>
-      </w:r>
-      <w:r>
-        <w:rPr>
-          <w:rFonts w:ascii="Arial" w:hAnsi="Arial" w:cs="Arial"/>
-          <w:bCs/>
-          <w:color w:val="000000" w:themeColor="text1"/>
-          <w:sz w:val="24"/>
-          <w:szCs w:val="24"/>
-        </w:rPr>
-        <w:fldChar w:fldCharType="separate"/>
-      </w:r>
-      <w:r>
-        <w:rPr>
-          <w:rStyle w:val="Hipervnculo"/>
-          <w:rFonts w:ascii="Arial" w:hAnsi="Arial" w:cs="Arial"/>
-          <w:bCs/>
-          <w:sz w:val="24"/>
-          <w:szCs w:val="24"/>
-        </w:rPr>
-        <w:t>https://doi.org/10.1016/j.compag.2021.106542</w:t>
-      </w:r>
-      <w:r>
-        <w:rPr>
-          <w:rFonts w:ascii="Arial" w:hAnsi="Arial" w:cs="Arial"/>
-          <w:bCs/>
-          <w:color w:val="000000" w:themeColor="text1"/>
-          <w:sz w:val="24"/>
-          <w:szCs w:val="24"/>
-        </w:rPr>
-        <w:fldChar w:fldCharType="end"/>
-      </w:r>
+      <w:hyperlink r:id="rId28" w:history="1">
+        <w:r>
+          <w:rPr>
+            <w:rStyle w:val="Hipervnculo"/>
+            <w:rFonts w:ascii="Arial" w:hAnsi="Arial" w:cs="Arial"/>
+            <w:bCs/>
+            <w:sz w:val="24"/>
+            <w:szCs w:val="24"/>
+          </w:rPr>
+          <w:t>https://doi.org/10.1016/j.compag.2021.106542</w:t>
+        </w:r>
+      </w:hyperlink>
     </w:p>
     <w:p>
       <w:pPr>
@@ -12871,76 +12458,18 @@
         </w:rPr>
         <w:t xml:space="preserve">, 11(9), 57–75. </w:t>
       </w:r>
-      <w:r>
-        <w:rPr>
-          <w:rFonts w:ascii="Arial" w:hAnsi="Arial" w:cs="Arial"/>
-          <w:bCs/>
-          <w:color w:val="000000" w:themeColor="text1"/>
-          <w:sz w:val="24"/>
-          <w:szCs w:val="24"/>
-        </w:rPr>
-        <w:fldChar w:fldCharType="begin"/>
-      </w:r>
-      <w:r>
-        <w:rPr>
-          <w:rFonts w:ascii="Arial" w:hAnsi="Arial" w:cs="Arial"/>
-          <w:bCs/>
-          <w:color w:val="000000" w:themeColor="text1"/>
-          <w:sz w:val="24"/>
-          <w:szCs w:val="24"/>
-        </w:rPr>
-        <w:instrText xml:space="preserve"> HYPERLINK "</w:instrText>
-      </w:r>
-      <w:r>
-        <w:rPr>
-          <w:rFonts w:ascii="Arial" w:hAnsi="Arial" w:cs="Arial"/>
-          <w:bCs/>
-          <w:color w:val="000000" w:themeColor="text1"/>
-          <w:sz w:val="24"/>
-          <w:szCs w:val="24"/>
-        </w:rPr>
-        <w:instrText>https://doi.org/10.4236/jcc.2023.119004</w:instrText>
-      </w:r>
-      <w:r>
-        <w:rPr>
-          <w:rFonts w:ascii="Arial" w:hAnsi="Arial" w:cs="Arial"/>
-          <w:bCs/>
-          <w:color w:val="000000" w:themeColor="text1"/>
-          <w:sz w:val="24"/>
-          <w:szCs w:val="24"/>
-        </w:rPr>
-        <w:instrText xml:space="preserve">" </w:instrText>
-      </w:r>
-      <w:r>
-        <w:rPr>
-          <w:rFonts w:ascii="Arial" w:hAnsi="Arial" w:cs="Arial"/>
-          <w:bCs/>
-          <w:color w:val="000000" w:themeColor="text1"/>
-          <w:sz w:val="24"/>
-          <w:szCs w:val="24"/>
-        </w:rPr>
-        <w:fldChar w:fldCharType="separate"/>
-      </w:r>
-      <w:r>
-        <w:rPr>
-          <w:rStyle w:val="Hipervnculo"/>
-          <w:rFonts w:ascii="Arial" w:hAnsi="Arial" w:cs="Arial"/>
-          <w:bCs/>
-          <w:sz w:val="24"/>
-          <w:szCs w:val="24"/>
-        </w:rPr>
-        <w:t>https://doi.org/10.4236/jcc.2023.119004</w:t>
-      </w:r>
-      <w:r>
-        <w:rPr>
-          <w:rFonts w:ascii="Arial" w:hAnsi="Arial" w:cs="Arial"/>
-          <w:bCs/>
-          <w:color w:val="000000" w:themeColor="text1"/>
-          <w:sz w:val="24"/>
-          <w:szCs w:val="24"/>
-        </w:rPr>
-        <w:fldChar w:fldCharType="end"/>
-      </w:r>
+      <w:hyperlink r:id="rId29" w:history="1">
+        <w:r>
+          <w:rPr>
+            <w:rStyle w:val="Hipervnculo"/>
+            <w:rFonts w:ascii="Arial" w:hAnsi="Arial" w:cs="Arial"/>
+            <w:bCs/>
+            <w:sz w:val="24"/>
+            <w:szCs w:val="24"/>
+          </w:rPr>
+          <w:t>https://doi.org/10.4236/jcc.2023.119004</w:t>
+        </w:r>
+      </w:hyperlink>
     </w:p>
     <w:p>
       <w:pPr>
@@ -13848,76 +13377,18 @@
         </w:rPr>
         <w:t xml:space="preserve">, 42(1), 1–24. </w:t>
       </w:r>
-      <w:r>
-        <w:rPr>
-          <w:rFonts w:ascii="Arial" w:hAnsi="Arial" w:cs="Arial"/>
-          <w:bCs/>
-          <w:color w:val="000000" w:themeColor="text1"/>
-          <w:sz w:val="24"/>
-          <w:szCs w:val="24"/>
-        </w:rPr>
-        <w:fldChar w:fldCharType="begin"/>
-      </w:r>
-      <w:r>
-        <w:rPr>
-          <w:rFonts w:ascii="Arial" w:hAnsi="Arial" w:cs="Arial"/>
-          <w:bCs/>
-          <w:color w:val="000000" w:themeColor="text1"/>
-          <w:sz w:val="24"/>
-          <w:szCs w:val="24"/>
-        </w:rPr>
-        <w:instrText xml:space="preserve"> HYPERLINK "</w:instrText>
-      </w:r>
-      <w:r>
-        <w:rPr>
-          <w:rFonts w:ascii="Arial" w:hAnsi="Arial" w:cs="Arial"/>
-          <w:bCs/>
-          <w:color w:val="000000" w:themeColor="text1"/>
-          <w:sz w:val="24"/>
-          <w:szCs w:val="24"/>
-        </w:rPr>
-        <w:instrText>https://doi.org/10.5423/PPJ.RW.01.2026.0004</w:instrText>
-      </w:r>
-      <w:r>
-        <w:rPr>
-          <w:rFonts w:ascii="Arial" w:hAnsi="Arial" w:cs="Arial"/>
-          <w:bCs/>
-          <w:color w:val="000000" w:themeColor="text1"/>
-          <w:sz w:val="24"/>
-          <w:szCs w:val="24"/>
-        </w:rPr>
-        <w:instrText xml:space="preserve">" </w:instrText>
-      </w:r>
-      <w:r>
-        <w:rPr>
-          <w:rFonts w:ascii="Arial" w:hAnsi="Arial" w:cs="Arial"/>
-          <w:bCs/>
-          <w:color w:val="000000" w:themeColor="text1"/>
-          <w:sz w:val="24"/>
-          <w:szCs w:val="24"/>
-        </w:rPr>
-        <w:fldChar w:fldCharType="separate"/>
-      </w:r>
-      <w:r>
-        <w:rPr>
-          <w:rStyle w:val="Hipervnculo"/>
-          <w:rFonts w:ascii="Arial" w:hAnsi="Arial" w:cs="Arial"/>
-          <w:bCs/>
-          <w:sz w:val="24"/>
-          <w:szCs w:val="24"/>
-        </w:rPr>
-        <w:t>https://doi.org/10.5423/PPJ.RW.01.2026.0004</w:t>
-      </w:r>
-      <w:r>
-        <w:rPr>
-          <w:rFonts w:ascii="Arial" w:hAnsi="Arial" w:cs="Arial"/>
-          <w:bCs/>
-          <w:color w:val="000000" w:themeColor="text1"/>
-          <w:sz w:val="24"/>
-          <w:szCs w:val="24"/>
-        </w:rPr>
-        <w:fldChar w:fldCharType="end"/>
-      </w:r>
+      <w:hyperlink r:id="rId30" w:history="1">
+        <w:r>
+          <w:rPr>
+            <w:rStyle w:val="Hipervnculo"/>
+            <w:rFonts w:ascii="Arial" w:hAnsi="Arial" w:cs="Arial"/>
+            <w:bCs/>
+            <w:sz w:val="24"/>
+            <w:szCs w:val="24"/>
+          </w:rPr>
+          <w:t>https://doi.org/10.5423/PPJ.RW.01.2026.0004</w:t>
+        </w:r>
+      </w:hyperlink>
     </w:p>
     <w:p>
       <w:pPr>
@@ -14215,29 +13686,7 @@
           <w:sz w:val="24"/>
           <w:szCs w:val="24"/>
         </w:rPr>
-        <w:t xml:space="preserve"> </w:t>
-      </w:r>
-      <w:proofErr w:type="spellStart"/>
-      <w:r>
-        <w:rPr>
-          <w:rFonts w:ascii="Arial" w:hAnsi="Arial" w:cs="Arial"/>
-          <w:bCs/>
-          <w:color w:val="000000" w:themeColor="text1"/>
-          <w:sz w:val="24"/>
-          <w:szCs w:val="24"/>
-        </w:rPr>
-        <w:t>of</w:t>
-      </w:r>
-      <w:proofErr w:type="spellEnd"/>
-      <w:r>
-        <w:rPr>
-          <w:rFonts w:ascii="Arial" w:hAnsi="Arial" w:cs="Arial"/>
-          <w:bCs/>
-          <w:color w:val="000000" w:themeColor="text1"/>
-          <w:sz w:val="24"/>
-          <w:szCs w:val="24"/>
-        </w:rPr>
-        <w:t xml:space="preserve"> Molecular </w:t>
+        <w:t xml:space="preserve"> of Molecular </w:t>
       </w:r>
       <w:proofErr w:type="spellStart"/>
       <w:r>
@@ -14261,76 +13710,18 @@
         </w:rPr>
         <w:t xml:space="preserve">, 25(1), 106. </w:t>
       </w:r>
-      <w:r>
-        <w:rPr>
-          <w:rFonts w:ascii="Arial" w:hAnsi="Arial" w:cs="Arial"/>
-          <w:bCs/>
-          <w:color w:val="000000" w:themeColor="text1"/>
-          <w:sz w:val="24"/>
-          <w:szCs w:val="24"/>
-        </w:rPr>
-        <w:fldChar w:fldCharType="begin"/>
-      </w:r>
-      <w:r>
-        <w:rPr>
-          <w:rFonts w:ascii="Arial" w:hAnsi="Arial" w:cs="Arial"/>
-          <w:bCs/>
-          <w:color w:val="000000" w:themeColor="text1"/>
-          <w:sz w:val="24"/>
-          <w:szCs w:val="24"/>
-        </w:rPr>
-        <w:instrText xml:space="preserve"> HYPERLINK "</w:instrText>
-      </w:r>
-      <w:r>
-        <w:rPr>
-          <w:rFonts w:ascii="Arial" w:hAnsi="Arial" w:cs="Arial"/>
-          <w:bCs/>
-          <w:color w:val="000000" w:themeColor="text1"/>
-          <w:sz w:val="24"/>
-          <w:szCs w:val="24"/>
-        </w:rPr>
-        <w:instrText>https://doi.org/10.3390/ijms25010106</w:instrText>
-      </w:r>
-      <w:r>
-        <w:rPr>
-          <w:rFonts w:ascii="Arial" w:hAnsi="Arial" w:cs="Arial"/>
-          <w:bCs/>
-          <w:color w:val="000000" w:themeColor="text1"/>
-          <w:sz w:val="24"/>
-          <w:szCs w:val="24"/>
-        </w:rPr>
-        <w:instrText xml:space="preserve">" </w:instrText>
-      </w:r>
-      <w:r>
-        <w:rPr>
-          <w:rFonts w:ascii="Arial" w:hAnsi="Arial" w:cs="Arial"/>
-          <w:bCs/>
-          <w:color w:val="000000" w:themeColor="text1"/>
-          <w:sz w:val="24"/>
-          <w:szCs w:val="24"/>
-        </w:rPr>
-        <w:fldChar w:fldCharType="separate"/>
-      </w:r>
-      <w:r>
-        <w:rPr>
-          <w:rStyle w:val="Hipervnculo"/>
-          <w:rFonts w:ascii="Arial" w:hAnsi="Arial" w:cs="Arial"/>
-          <w:bCs/>
-          <w:sz w:val="24"/>
-          <w:szCs w:val="24"/>
-        </w:rPr>
-        <w:t>https://doi.org/10.3390/ijms25010106</w:t>
-      </w:r>
-      <w:r>
-        <w:rPr>
-          <w:rFonts w:ascii="Arial" w:hAnsi="Arial" w:cs="Arial"/>
-          <w:bCs/>
-          <w:color w:val="000000" w:themeColor="text1"/>
-          <w:sz w:val="24"/>
-          <w:szCs w:val="24"/>
-        </w:rPr>
-        <w:fldChar w:fldCharType="end"/>
-      </w:r>
+      <w:hyperlink r:id="rId31" w:history="1">
+        <w:r>
+          <w:rPr>
+            <w:rStyle w:val="Hipervnculo"/>
+            <w:rFonts w:ascii="Arial" w:hAnsi="Arial" w:cs="Arial"/>
+            <w:bCs/>
+            <w:sz w:val="24"/>
+            <w:szCs w:val="24"/>
+          </w:rPr>
+          <w:t>https://doi.org/10.3390/ijms25010106</w:t>
+        </w:r>
+      </w:hyperlink>
     </w:p>
     <w:p>
       <w:pPr>
@@ -14596,76 +13987,18 @@
         </w:rPr>
         <w:t xml:space="preserve"> (CVPR), 770–778. </w:t>
       </w:r>
-      <w:r>
-        <w:rPr>
-          <w:rFonts w:ascii="Arial" w:hAnsi="Arial" w:cs="Arial"/>
-          <w:bCs/>
-          <w:color w:val="000000" w:themeColor="text1"/>
-          <w:sz w:val="24"/>
-          <w:szCs w:val="24"/>
-        </w:rPr>
-        <w:fldChar w:fldCharType="begin"/>
-      </w:r>
-      <w:r>
-        <w:rPr>
-          <w:rFonts w:ascii="Arial" w:hAnsi="Arial" w:cs="Arial"/>
-          <w:bCs/>
-          <w:color w:val="000000" w:themeColor="text1"/>
-          <w:sz w:val="24"/>
-          <w:szCs w:val="24"/>
-        </w:rPr>
-        <w:instrText xml:space="preserve"> HYPERLINK "</w:instrText>
-      </w:r>
-      <w:r>
-        <w:rPr>
-          <w:rFonts w:ascii="Arial" w:hAnsi="Arial" w:cs="Arial"/>
-          <w:bCs/>
-          <w:color w:val="000000" w:themeColor="text1"/>
-          <w:sz w:val="24"/>
-          <w:szCs w:val="24"/>
-        </w:rPr>
-        <w:instrText>https://doi.org/10.1109/CVPR.2016.90</w:instrText>
-      </w:r>
-      <w:r>
-        <w:rPr>
-          <w:rFonts w:ascii="Arial" w:hAnsi="Arial" w:cs="Arial"/>
-          <w:bCs/>
-          <w:color w:val="000000" w:themeColor="text1"/>
-          <w:sz w:val="24"/>
-          <w:szCs w:val="24"/>
-        </w:rPr>
-        <w:instrText xml:space="preserve">" </w:instrText>
-      </w:r>
-      <w:r>
-        <w:rPr>
-          <w:rFonts w:ascii="Arial" w:hAnsi="Arial" w:cs="Arial"/>
-          <w:bCs/>
-          <w:color w:val="000000" w:themeColor="text1"/>
-          <w:sz w:val="24"/>
-          <w:szCs w:val="24"/>
-        </w:rPr>
-        <w:fldChar w:fldCharType="separate"/>
-      </w:r>
-      <w:r>
-        <w:rPr>
-          <w:rStyle w:val="Hipervnculo"/>
-          <w:rFonts w:ascii="Arial" w:hAnsi="Arial" w:cs="Arial"/>
-          <w:bCs/>
-          <w:sz w:val="24"/>
-          <w:szCs w:val="24"/>
-        </w:rPr>
-        <w:t>https://doi.org/10.1109/CVPR.2016.90</w:t>
-      </w:r>
-      <w:r>
-        <w:rPr>
-          <w:rFonts w:ascii="Arial" w:hAnsi="Arial" w:cs="Arial"/>
-          <w:bCs/>
-          <w:color w:val="000000" w:themeColor="text1"/>
-          <w:sz w:val="24"/>
-          <w:szCs w:val="24"/>
-        </w:rPr>
-        <w:fldChar w:fldCharType="end"/>
-      </w:r>
+      <w:hyperlink r:id="rId32" w:history="1">
+        <w:r>
+          <w:rPr>
+            <w:rStyle w:val="Hipervnculo"/>
+            <w:rFonts w:ascii="Arial" w:hAnsi="Arial" w:cs="Arial"/>
+            <w:bCs/>
+            <w:sz w:val="24"/>
+            <w:szCs w:val="24"/>
+          </w:rPr>
+          <w:t>https://doi.org/10.1109/CVPR.2016.90</w:t>
+        </w:r>
+      </w:hyperlink>
     </w:p>
     <w:p>
       <w:pPr>
@@ -15009,76 +14342,18 @@
         </w:rPr>
         <w:t xml:space="preserve">), 9(6), 1042–1051. </w:t>
       </w:r>
-      <w:r>
-        <w:rPr>
-          <w:rFonts w:ascii="Arial" w:hAnsi="Arial" w:cs="Arial"/>
-          <w:bCs/>
-          <w:color w:val="000000" w:themeColor="text1"/>
-          <w:sz w:val="24"/>
-          <w:szCs w:val="24"/>
-        </w:rPr>
-        <w:fldChar w:fldCharType="begin"/>
-      </w:r>
-      <w:r>
-        <w:rPr>
-          <w:rFonts w:ascii="Arial" w:hAnsi="Arial" w:cs="Arial"/>
-          <w:bCs/>
-          <w:color w:val="000000" w:themeColor="text1"/>
-          <w:sz w:val="24"/>
-          <w:szCs w:val="24"/>
-        </w:rPr>
-        <w:instrText xml:space="preserve"> HYPERLINK "</w:instrText>
-      </w:r>
-      <w:r>
-        <w:rPr>
-          <w:rFonts w:ascii="Arial" w:hAnsi="Arial" w:cs="Arial"/>
-          <w:bCs/>
-          <w:color w:val="000000" w:themeColor="text1"/>
-          <w:sz w:val="24"/>
-          <w:szCs w:val="24"/>
-        </w:rPr>
-        <w:instrText>https://doi.org/10.29207/resti.v9i6.6271</w:instrText>
-      </w:r>
-      <w:r>
-        <w:rPr>
-          <w:rFonts w:ascii="Arial" w:hAnsi="Arial" w:cs="Arial"/>
-          <w:bCs/>
-          <w:color w:val="000000" w:themeColor="text1"/>
-          <w:sz w:val="24"/>
-          <w:szCs w:val="24"/>
-        </w:rPr>
-        <w:instrText xml:space="preserve">" </w:instrText>
-      </w:r>
-      <w:r>
-        <w:rPr>
-          <w:rFonts w:ascii="Arial" w:hAnsi="Arial" w:cs="Arial"/>
-          <w:bCs/>
-          <w:color w:val="000000" w:themeColor="text1"/>
-          <w:sz w:val="24"/>
-          <w:szCs w:val="24"/>
-        </w:rPr>
-        <w:fldChar w:fldCharType="separate"/>
-      </w:r>
-      <w:r>
-        <w:rPr>
-          <w:rStyle w:val="Hipervnculo"/>
-          <w:rFonts w:ascii="Arial" w:hAnsi="Arial" w:cs="Arial"/>
-          <w:bCs/>
-          <w:sz w:val="24"/>
-          <w:szCs w:val="24"/>
-        </w:rPr>
-        <w:t>https://doi.org/10.29207/resti.v9i6.6271</w:t>
-      </w:r>
-      <w:r>
-        <w:rPr>
-          <w:rFonts w:ascii="Arial" w:hAnsi="Arial" w:cs="Arial"/>
-          <w:bCs/>
-          <w:color w:val="000000" w:themeColor="text1"/>
-          <w:sz w:val="24"/>
-          <w:szCs w:val="24"/>
-        </w:rPr>
-        <w:fldChar w:fldCharType="end"/>
-      </w:r>
+      <w:hyperlink r:id="rId33" w:history="1">
+        <w:r>
+          <w:rPr>
+            <w:rStyle w:val="Hipervnculo"/>
+            <w:rFonts w:ascii="Arial" w:hAnsi="Arial" w:cs="Arial"/>
+            <w:bCs/>
+            <w:sz w:val="24"/>
+            <w:szCs w:val="24"/>
+          </w:rPr>
+          <w:t>https://doi.org/10.29207/resti.v9i6.6271</w:t>
+        </w:r>
+      </w:hyperlink>
     </w:p>
     <w:p>
       <w:pPr>
@@ -15156,29 +14431,7 @@
           <w:sz w:val="24"/>
           <w:szCs w:val="24"/>
         </w:rPr>
-        <w:t xml:space="preserve">, H., Rahman, M., Rana, J. A., &amp; </w:t>
-      </w:r>
-      <w:proofErr w:type="gramStart"/>
-      <w:r>
-        <w:rPr>
-          <w:rFonts w:ascii="Arial" w:hAnsi="Arial" w:cs="Arial"/>
-          <w:bCs/>
-          <w:color w:val="000000" w:themeColor="text1"/>
-          <w:sz w:val="24"/>
-          <w:szCs w:val="24"/>
-        </w:rPr>
-        <w:t>Islam</w:t>
-      </w:r>
-      <w:proofErr w:type="gramEnd"/>
-      <w:r>
-        <w:rPr>
-          <w:rFonts w:ascii="Arial" w:hAnsi="Arial" w:cs="Arial"/>
-          <w:bCs/>
-          <w:color w:val="000000" w:themeColor="text1"/>
-          <w:sz w:val="24"/>
-          <w:szCs w:val="24"/>
-        </w:rPr>
-        <w:t xml:space="preserve">, S. M. N. (2024). </w:t>
+        <w:t xml:space="preserve">, H., Rahman, M., Rana, J. A., &amp; Islam, S. M. N. (2024). </w:t>
       </w:r>
       <w:proofErr w:type="spellStart"/>
       <w:r>
@@ -15466,76 +14719,18 @@
         </w:rPr>
         <w:t xml:space="preserve">, 14, 1304205. </w:t>
       </w:r>
-      <w:r>
-        <w:rPr>
-          <w:rFonts w:ascii="Arial" w:hAnsi="Arial" w:cs="Arial"/>
-          <w:bCs/>
-          <w:color w:val="000000" w:themeColor="text1"/>
-          <w:sz w:val="24"/>
-          <w:szCs w:val="24"/>
-        </w:rPr>
-        <w:fldChar w:fldCharType="begin"/>
-      </w:r>
-      <w:r>
-        <w:rPr>
-          <w:rFonts w:ascii="Arial" w:hAnsi="Arial" w:cs="Arial"/>
-          <w:bCs/>
-          <w:color w:val="000000" w:themeColor="text1"/>
-          <w:sz w:val="24"/>
-          <w:szCs w:val="24"/>
-        </w:rPr>
-        <w:instrText xml:space="preserve"> HYPERLINK "</w:instrText>
-      </w:r>
-      <w:r>
-        <w:rPr>
-          <w:rFonts w:ascii="Arial" w:hAnsi="Arial" w:cs="Arial"/>
-          <w:bCs/>
-          <w:color w:val="000000" w:themeColor="text1"/>
-          <w:sz w:val="24"/>
-          <w:szCs w:val="24"/>
-        </w:rPr>
-        <w:instrText>https://doi.org/10.3389/fmicb.2023.1304205</w:instrText>
-      </w:r>
-      <w:r>
-        <w:rPr>
-          <w:rFonts w:ascii="Arial" w:hAnsi="Arial" w:cs="Arial"/>
-          <w:bCs/>
-          <w:color w:val="000000" w:themeColor="text1"/>
-          <w:sz w:val="24"/>
-          <w:szCs w:val="24"/>
-        </w:rPr>
-        <w:instrText xml:space="preserve">" </w:instrText>
-      </w:r>
-      <w:r>
-        <w:rPr>
-          <w:rFonts w:ascii="Arial" w:hAnsi="Arial" w:cs="Arial"/>
-          <w:bCs/>
-          <w:color w:val="000000" w:themeColor="text1"/>
-          <w:sz w:val="24"/>
-          <w:szCs w:val="24"/>
-        </w:rPr>
-        <w:fldChar w:fldCharType="separate"/>
-      </w:r>
-      <w:r>
-        <w:rPr>
-          <w:rStyle w:val="Hipervnculo"/>
-          <w:rFonts w:ascii="Arial" w:hAnsi="Arial" w:cs="Arial"/>
-          <w:bCs/>
-          <w:sz w:val="24"/>
-          <w:szCs w:val="24"/>
-        </w:rPr>
-        <w:t>https://doi.org/10.3389/fmicb.2023.1304205</w:t>
-      </w:r>
-      <w:r>
-        <w:rPr>
-          <w:rFonts w:ascii="Arial" w:hAnsi="Arial" w:cs="Arial"/>
-          <w:bCs/>
-          <w:color w:val="000000" w:themeColor="text1"/>
-          <w:sz w:val="24"/>
-          <w:szCs w:val="24"/>
-        </w:rPr>
-        <w:fldChar w:fldCharType="end"/>
-      </w:r>
+      <w:hyperlink r:id="rId34" w:history="1">
+        <w:r>
+          <w:rPr>
+            <w:rStyle w:val="Hipervnculo"/>
+            <w:rFonts w:ascii="Arial" w:hAnsi="Arial" w:cs="Arial"/>
+            <w:bCs/>
+            <w:sz w:val="24"/>
+            <w:szCs w:val="24"/>
+          </w:rPr>
+          <w:t>https://doi.org/10.3389/fmicb.2023.1304205</w:t>
+        </w:r>
+      </w:hyperlink>
     </w:p>
     <w:p>
       <w:pPr>
@@ -15955,76 +15150,18 @@
         </w:rPr>
         <w:t xml:space="preserve">. </w:t>
       </w:r>
-      <w:r>
-        <w:rPr>
-          <w:rFonts w:ascii="Arial" w:hAnsi="Arial" w:cs="Arial"/>
-          <w:bCs/>
-          <w:color w:val="000000" w:themeColor="text1"/>
-          <w:sz w:val="24"/>
-          <w:szCs w:val="24"/>
-        </w:rPr>
-        <w:fldChar w:fldCharType="begin"/>
-      </w:r>
-      <w:r>
-        <w:rPr>
-          <w:rFonts w:ascii="Arial" w:hAnsi="Arial" w:cs="Arial"/>
-          <w:bCs/>
-          <w:color w:val="000000" w:themeColor="text1"/>
-          <w:sz w:val="24"/>
-          <w:szCs w:val="24"/>
-        </w:rPr>
-        <w:instrText xml:space="preserve"> HYPERLINK "</w:instrText>
-      </w:r>
-      <w:r>
-        <w:rPr>
-          <w:rFonts w:ascii="Arial" w:hAnsi="Arial" w:cs="Arial"/>
-          <w:bCs/>
-          <w:color w:val="000000" w:themeColor="text1"/>
-          <w:sz w:val="24"/>
-          <w:szCs w:val="24"/>
-        </w:rPr>
-        <w:instrText>https://doi.org/10.48550/arXiv.1511.08060</w:instrText>
-      </w:r>
-      <w:r>
-        <w:rPr>
-          <w:rFonts w:ascii="Arial" w:hAnsi="Arial" w:cs="Arial"/>
-          <w:bCs/>
-          <w:color w:val="000000" w:themeColor="text1"/>
-          <w:sz w:val="24"/>
-          <w:szCs w:val="24"/>
-        </w:rPr>
-        <w:instrText xml:space="preserve">" </w:instrText>
-      </w:r>
-      <w:r>
-        <w:rPr>
-          <w:rFonts w:ascii="Arial" w:hAnsi="Arial" w:cs="Arial"/>
-          <w:bCs/>
-          <w:color w:val="000000" w:themeColor="text1"/>
-          <w:sz w:val="24"/>
-          <w:szCs w:val="24"/>
-        </w:rPr>
-        <w:fldChar w:fldCharType="separate"/>
-      </w:r>
-      <w:r>
-        <w:rPr>
-          <w:rStyle w:val="Hipervnculo"/>
-          <w:rFonts w:ascii="Arial" w:hAnsi="Arial" w:cs="Arial"/>
-          <w:bCs/>
-          <w:sz w:val="24"/>
-          <w:szCs w:val="24"/>
-        </w:rPr>
-        <w:t>https://doi.org/10.48550/arXiv.1511.08060</w:t>
-      </w:r>
-      <w:r>
-        <w:rPr>
-          <w:rFonts w:ascii="Arial" w:hAnsi="Arial" w:cs="Arial"/>
-          <w:bCs/>
-          <w:color w:val="000000" w:themeColor="text1"/>
-          <w:sz w:val="24"/>
-          <w:szCs w:val="24"/>
-        </w:rPr>
-        <w:fldChar w:fldCharType="end"/>
-      </w:r>
+      <w:hyperlink r:id="rId35" w:history="1">
+        <w:r>
+          <w:rPr>
+            <w:rStyle w:val="Hipervnculo"/>
+            <w:rFonts w:ascii="Arial" w:hAnsi="Arial" w:cs="Arial"/>
+            <w:bCs/>
+            <w:sz w:val="24"/>
+            <w:szCs w:val="24"/>
+          </w:rPr>
+          <w:t>https://doi.org/10.48550/arXiv.1511.08060</w:t>
+        </w:r>
+      </w:hyperlink>
     </w:p>
     <w:p>
       <w:pPr>
@@ -16346,76 +15483,18 @@
         </w:rPr>
         <w:t xml:space="preserve"> [Conjunto de datos]. SSRN. </w:t>
       </w:r>
-      <w:r>
-        <w:rPr>
-          <w:rFonts w:ascii="Arial" w:hAnsi="Arial" w:cs="Arial"/>
-          <w:bCs/>
-          <w:color w:val="000000" w:themeColor="text1"/>
-          <w:sz w:val="24"/>
-          <w:szCs w:val="24"/>
-        </w:rPr>
-        <w:fldChar w:fldCharType="begin"/>
-      </w:r>
-      <w:r>
-        <w:rPr>
-          <w:rFonts w:ascii="Arial" w:hAnsi="Arial" w:cs="Arial"/>
-          <w:bCs/>
-          <w:color w:val="000000" w:themeColor="text1"/>
-          <w:sz w:val="24"/>
-          <w:szCs w:val="24"/>
-        </w:rPr>
-        <w:instrText xml:space="preserve"> HYPERLINK "</w:instrText>
-      </w:r>
-      <w:r>
-        <w:rPr>
-          <w:rFonts w:ascii="Arial" w:hAnsi="Arial" w:cs="Arial"/>
-          <w:bCs/>
-          <w:color w:val="000000" w:themeColor="text1"/>
-          <w:sz w:val="24"/>
-          <w:szCs w:val="24"/>
-        </w:rPr>
-        <w:instrText>https://doi.org/10.2139/ssrn.4644426</w:instrText>
-      </w:r>
-      <w:r>
-        <w:rPr>
-          <w:rFonts w:ascii="Arial" w:hAnsi="Arial" w:cs="Arial"/>
-          <w:bCs/>
-          <w:color w:val="000000" w:themeColor="text1"/>
-          <w:sz w:val="24"/>
-          <w:szCs w:val="24"/>
-        </w:rPr>
-        <w:instrText xml:space="preserve">" </w:instrText>
-      </w:r>
-      <w:r>
-        <w:rPr>
-          <w:rFonts w:ascii="Arial" w:hAnsi="Arial" w:cs="Arial"/>
-          <w:bCs/>
-          <w:color w:val="000000" w:themeColor="text1"/>
-          <w:sz w:val="24"/>
-          <w:szCs w:val="24"/>
-        </w:rPr>
-        <w:fldChar w:fldCharType="separate"/>
-      </w:r>
-      <w:r>
-        <w:rPr>
-          <w:rStyle w:val="Hipervnculo"/>
-          <w:rFonts w:ascii="Arial" w:hAnsi="Arial" w:cs="Arial"/>
-          <w:bCs/>
-          <w:sz w:val="24"/>
-          <w:szCs w:val="24"/>
-        </w:rPr>
-        <w:t>https://doi.org/10.2139/ssrn.4644426</w:t>
-      </w:r>
-      <w:r>
-        <w:rPr>
-          <w:rFonts w:ascii="Arial" w:hAnsi="Arial" w:cs="Arial"/>
-          <w:bCs/>
-          <w:color w:val="000000" w:themeColor="text1"/>
-          <w:sz w:val="24"/>
-          <w:szCs w:val="24"/>
-        </w:rPr>
-        <w:fldChar w:fldCharType="end"/>
-      </w:r>
+      <w:hyperlink r:id="rId36" w:history="1">
+        <w:r>
+          <w:rPr>
+            <w:rStyle w:val="Hipervnculo"/>
+            <w:rFonts w:ascii="Arial" w:hAnsi="Arial" w:cs="Arial"/>
+            <w:bCs/>
+            <w:sz w:val="24"/>
+            <w:szCs w:val="24"/>
+          </w:rPr>
+          <w:t>https://doi.org/10.2139/ssrn.4644426</w:t>
+        </w:r>
+      </w:hyperlink>
     </w:p>
     <w:p>
       <w:pPr>
@@ -16437,29 +15516,7 @@
           <w:sz w:val="24"/>
           <w:szCs w:val="24"/>
         </w:rPr>
-        <w:t xml:space="preserve">Li, G., Wang, Y., Zhao, Q., </w:t>
-      </w:r>
-      <w:proofErr w:type="gramStart"/>
-      <w:r>
-        <w:rPr>
-          <w:rFonts w:ascii="Arial" w:hAnsi="Arial" w:cs="Arial"/>
-          <w:bCs/>
-          <w:color w:val="000000" w:themeColor="text1"/>
-          <w:sz w:val="24"/>
-          <w:szCs w:val="24"/>
-        </w:rPr>
-        <w:t>Yuan</w:t>
-      </w:r>
-      <w:proofErr w:type="gramEnd"/>
-      <w:r>
-        <w:rPr>
-          <w:rFonts w:ascii="Arial" w:hAnsi="Arial" w:cs="Arial"/>
-          <w:bCs/>
-          <w:color w:val="000000" w:themeColor="text1"/>
-          <w:sz w:val="24"/>
-          <w:szCs w:val="24"/>
-        </w:rPr>
-        <w:t xml:space="preserve">, P., &amp; Chang, B. (2023). PMVT: A </w:t>
+        <w:t xml:space="preserve">Li, G., Wang, Y., Zhao, Q., Yuan, P., &amp; Chang, B. (2023). PMVT: A </w:t>
       </w:r>
       <w:proofErr w:type="spellStart"/>
       <w:r>
@@ -16747,7 +15804,7 @@
         </w:rPr>
         <w:t xml:space="preserve">, 14, 1256773. </w:t>
       </w:r>
-      <w:hyperlink r:id="rId23" w:history="1">
+      <w:hyperlink r:id="rId37" w:history="1">
         <w:r>
           <w:rPr>
             <w:rStyle w:val="Hipervnculo"/>
@@ -17124,7 +16181,7 @@
         </w:rPr>
         <w:t xml:space="preserve">, 20, 65. </w:t>
       </w:r>
-      <w:hyperlink r:id="rId24" w:history="1">
+      <w:hyperlink r:id="rId38" w:history="1">
         <w:r>
           <w:rPr>
             <w:rStyle w:val="Hipervnculo"/>
@@ -17436,7 +16493,7 @@
         </w:rPr>
         <w:t xml:space="preserve">, 12(2), 153–157. </w:t>
       </w:r>
-      <w:hyperlink r:id="rId25" w:history="1">
+      <w:hyperlink r:id="rId39" w:history="1">
         <w:r>
           <w:rPr>
             <w:rStyle w:val="Hipervnculo"/>
@@ -17681,7 +16738,7 @@
         </w:rPr>
         <w:t xml:space="preserve">, 99(10), 1310–1316. </w:t>
       </w:r>
-      <w:hyperlink r:id="rId26" w:history="1">
+      <w:hyperlink r:id="rId40" w:history="1">
         <w:r>
           <w:rPr>
             <w:rStyle w:val="Hipervnculo"/>
@@ -17980,7 +17037,7 @@
         </w:rPr>
         <w:t xml:space="preserve">, 49, 109447. </w:t>
       </w:r>
-      <w:hyperlink r:id="rId27" w:history="1">
+      <w:hyperlink r:id="rId41" w:history="1">
         <w:r>
           <w:rPr>
             <w:rStyle w:val="Hipervnculo"/>
@@ -18247,7 +17304,7 @@
         </w:rPr>
         <w:t xml:space="preserve"> – MICCAI 2015, 234–241. </w:t>
       </w:r>
-      <w:hyperlink r:id="rId28" w:history="1">
+      <w:hyperlink r:id="rId42" w:history="1">
         <w:r>
           <w:rPr>
             <w:rStyle w:val="Hipervnculo"/>
@@ -18536,7 +17593,7 @@
         </w:rPr>
         <w:t xml:space="preserve"> Data, 12, Artículo 7092. </w:t>
       </w:r>
-      <w:hyperlink r:id="rId29" w:history="1">
+      <w:hyperlink r:id="rId43" w:history="1">
         <w:r>
           <w:rPr>
             <w:rStyle w:val="Hipervnculo"/>
@@ -18847,7 +17904,7 @@
         </w:rPr>
         <w:t xml:space="preserve"> [Conjunto de datos]. Mendeley Data. </w:t>
       </w:r>
-      <w:hyperlink r:id="rId30" w:history="1">
+      <w:hyperlink r:id="rId44" w:history="1">
         <w:r>
           <w:rPr>
             <w:rStyle w:val="Hipervnculo"/>
@@ -19114,7 +18171,7 @@
         </w:rPr>
         <w:t xml:space="preserve"> Big Data, 6, 60. </w:t>
       </w:r>
-      <w:hyperlink r:id="rId31" w:history="1">
+      <w:hyperlink r:id="rId45" w:history="1">
         <w:r>
           <w:rPr>
             <w:rStyle w:val="Hipervnculo"/>
@@ -19435,7 +18492,7 @@
         </w:rPr>
         <w:t xml:space="preserve"> (ICML), PMLR 97, 6105–6114. </w:t>
       </w:r>
-      <w:hyperlink r:id="rId32" w:history="1">
+      <w:hyperlink r:id="rId46" w:history="1">
         <w:r>
           <w:rPr>
             <w:rStyle w:val="Hipervnculo"/>
@@ -19746,7 +18803,7 @@
         </w:rPr>
         <w:t xml:space="preserve"> No. BL2024-0001). USDA-FAS. </w:t>
       </w:r>
-      <w:hyperlink r:id="rId33" w:history="1">
+      <w:hyperlink r:id="rId47" w:history="1">
         <w:r>
           <w:rPr>
             <w:rStyle w:val="Hipervnculo"/>
@@ -20420,7 +19477,7 @@
                     <pic:cNvPicPr/>
                   </pic:nvPicPr>
                   <pic:blipFill>
-                    <a:blip r:embed="rId34" cstate="print"/>
+                    <a:blip r:embed="rId48" cstate="print"/>
                     <a:stretch>
                       <a:fillRect/>
                     </a:stretch>
@@ -20525,7 +19582,7 @@
         </w:rPr>
         <w:t xml:space="preserve">Este texto está protegido por la </w:t>
       </w:r>
-      <w:hyperlink r:id="rId35">
+      <w:hyperlink r:id="rId49">
         <w:r>
           <w:rPr>
             <w:rFonts w:ascii="Arial" w:hAnsi="Arial" w:cs="Arial"/>
@@ -20561,7 +19618,7 @@
         </w:rPr>
         <w:t xml:space="preserve"> </w:t>
       </w:r>
-      <w:hyperlink r:id="rId36">
+      <w:hyperlink r:id="rId50">
         <w:r>
           <w:rPr>
             <w:rFonts w:ascii="Arial" w:hAnsi="Arial" w:cs="Arial"/>
@@ -21628,7 +20685,7 @@
       <w:bookmarkEnd w:id="28"/>
     </w:p>
     <w:sectPr>
-      <w:footerReference w:type="default" r:id="rId37"/>
+      <w:footerReference w:type="default" r:id="rId51"/>
       <w:pgSz w:w="12240" w:h="15840"/>
       <w:pgMar w:top="1440" w:right="1440" w:bottom="1440" w:left="1440" w:header="0" w:footer="522" w:gutter="0"/>
       <w:cols w:space="720"/>
@@ -21712,14 +20769,14 @@
         <v:path o:extrusionok="f" gradientshapeok="t" o:connecttype="rect"/>
         <o:lock v:ext="edit" aspectratio="t"/>
       </v:shapetype>
-      <v:shape id="_x0000_i1474" type="#_x0000_t75" style="width:23.8pt;height:23.8pt;visibility:visible;mso-wrap-style:square" o:bullet="t">
+      <v:shape id="_x0000_i1042" type="#_x0000_t75" style="width:23.8pt;height:23.8pt;visibility:visible;mso-wrap-style:square" o:bullet="t">
         <v:imagedata r:id="rId1" o:title=""/>
       </v:shape>
     </w:pict>
   </w:numPicBullet>
   <w:numPicBullet w:numPicBulletId="1">
     <w:pict>
-      <v:shape id="_x0000_i1475" type="#_x0000_t75" style="width:10.65pt;height:10.65pt;visibility:visible;mso-wrap-style:square" o:bullet="t">
+      <v:shape id="_x0000_i1043" type="#_x0000_t75" style="width:10.65pt;height:10.65pt;visibility:visible;mso-wrap-style:square" o:bullet="t">
         <v:imagedata r:id="rId2" o:title=""/>
       </v:shape>
     </w:pict>
@@ -22749,6 +21806,7 @@
   <w:style w:type="character" w:default="1" w:styleId="Fuentedeprrafopredeter">
     <w:name w:val="Default Paragraph Font"/>
     <w:uiPriority w:val="1"/>
+    <w:semiHidden/>
     <w:unhideWhenUsed/>
   </w:style>
   <w:style w:type="table" w:default="1" w:styleId="Tablanormal">

</xml_diff>